<commit_message>
Revise health requirement v2: remove disease-free-zone dependency for Korea export
- Article 1.3 / 2: remove 'free zone/free period' conditions that Korea (FMD-vaccinating, LSD-present) cannot meet
- Anchor sanitary safety on IETS/WOAH washing principle independent of exporting country disease status
- Keeps Korea export unobstructed while following standard international embryo trade rules
- Updated KO and EN Word deliverables

https://claude.ai/code/session_01JRKJZw8Qbfes22ZyVqJCWL
</commit_message>
<xml_diff>
--- a/exports/Korea_Holstein_IVF_Embryo_Health_Requirement_EN.docx
+++ b/exports/Korea_Holstein_IVF_Embryo_Health_Requirement_EN.docx
@@ -312,11 +312,11 @@
     <w:p>
       <w:r>
         <w:rPr>
-          <w:b w:val="0"/>
+          <w:b/>
           <w:i w:val="0"/>
           <w:sz w:val="21"/>
         </w:rPr>
-        <w:t>1.3 With regard to WOAH-listed diseases (FMD, CBPP, Lumpy Skin Disease, etc.), the donor farm and processing facility meet the freedom or control conditions agreed between the two veterinary authorities at the time of collection.</w:t>
+        <w:t>1.3 The WOAH Terrestrial Animal Health Code provides that the risk of transmission of infectious disease through an embryo with an intact zona pellucida that has been properly washed is negligible. Accordingly, these health requirements do not depend on the individual disease occurrence status of the exporting country; sanitary safety is ensured through compliance with the IETS/WOAH washing and examination standards set out in Article 4.</w:t>
       </w:r>
     </w:p>
     <w:p>
@@ -326,7 +326,7 @@
           <w:color w:val="7F7F7F"/>
           <w:sz w:val="19"/>
         </w:rPr>
-        <w:t>(Free zones, free periods and vaccination policy to be finalised by bilateral agreement.)</w:t>
+        <w:t>(This Article is based on the WOAH/IETS international standard principle on embryo-mediated disease transmission; details to be finalised by bilateral agreement.)</w:t>
       </w:r>
     </w:p>
     <w:p>
@@ -346,7 +346,7 @@
           <w:i w:val="0"/>
           <w:sz w:val="21"/>
         </w:rPr>
-        <w:t>2.1 Donors were clinically healthy and showed no signs of transmissible disease on the day of oocyte collection.</w:t>
+        <w:t>2.1 Donors were clinically healthy and showed no clinical signs of transmissible disease on the day of oocyte collection.</w:t>
       </w:r>
     </w:p>
     <w:p>
@@ -356,7 +356,7 @@
           <w:i w:val="0"/>
           <w:sz w:val="21"/>
         </w:rPr>
-        <w:t>2.2 Donors were kept, for the agreed period prior to collection, on farms free from WOAH-listed diseases.</w:t>
+        <w:t>2.2 Donors originated from a husbandry and collection environment managed in accordance with the standard operating procedures (SOPs) of the approved facility and the IETS Manual.</w:t>
       </w:r>
     </w:p>
     <w:p>
@@ -366,7 +366,7 @@
           <w:i w:val="0"/>
           <w:sz w:val="21"/>
         </w:rPr>
-        <w:t>2.3 Donors tested negative, by methods recognised by APQA, for Bovine Tuberculosis, Brucellosis, Enzootic Bovine Leukosis and IBR/IPV (and others as agreed), or were exempted under free-farm / free-zone conditions.</w:t>
+        <w:t>2.3 Donors tested negative, by methods recognised by APQA, for Bovine Tuberculosis, Brucellosis, Enzootic Bovine Leukosis and IBR/IPV (and others as agreed), or this is satisfied by the sanitary management conditions of the facility/farm.</w:t>
       </w:r>
     </w:p>
     <w:p>
@@ -376,7 +376,7 @@
           <w:color w:val="7F7F7F"/>
           <w:sz w:val="19"/>
         </w:rPr>
-        <w:t>(Test panel and timing to be finalised by bilateral agreement.)</w:t>
+        <w:t>(Test panel and timing to be finalised by bilateral agreement. Embryo-mediated transmission risk is primarily controlled by the washing principle of Article 4.)</w:t>
       </w:r>
     </w:p>
     <w:p>
@@ -386,7 +386,7 @@
           <w:i w:val="0"/>
           <w:sz w:val="21"/>
         </w:rPr>
-        <w:t>2.4 Records of donor isolation, observation and health are retained at the facility and made available to the importing authority on request.</w:t>
+        <w:t>2.4 Records of donor observation and health are retained at the facility and made available to the importing authority on request.</w:t>
       </w:r>
     </w:p>
     <w:p>

</xml_diff>

<commit_message>
Add licensed-facility particulars block to Article 5 (KO/EN)
- Reflect that the exporter holds a national semen/embryo processing licence under the Livestock Industry Act
- Competent authority: Gyeonggi Province / Anseong
- Add fill-in table for licence name, number, type, authority, date, address

https://claude.ai/code/session_01JRKJZw8Qbfes22ZyVqJCWL
</commit_message>
<xml_diff>
--- a/exports/Korea_Holstein_IVF_Embryo_Health_Requirement_EN.docx
+++ b/exports/Korea_Holstein_IVF_Embryo_Health_Requirement_EN.docx
@@ -516,7 +516,7 @@
           <w:i w:val="0"/>
           <w:sz w:val="21"/>
         </w:rPr>
-        <w:t>5.1 The IVF embryos were produced, processed, frozen and stored at a facility licensed by the Government of Korea (MAFRA/APQA) for the processing of semen and embryos for artificial insemination, under the supervision of an Official Veterinarian or the facility's responsible veterinarian.</w:t>
+        <w:t>5.1 The IVF embryos were produced, processed, frozen and stored at a facility holding a licence for the processing of semen and embryos for artificial insemination, granted by the competent authority under the Livestock Industry Act of the Republic of Korea, under the supervision of the facility's responsible veterinarian. This licence constitutes a national licence granted under the licensing system of the Government of the Republic of Korea.</w:t>
       </w:r>
     </w:p>
     <w:p>
@@ -532,11 +532,180 @@
     <w:p>
       <w:r>
         <w:rPr>
+          <w:b w:val="0"/>
+          <w:i w:val="0"/>
+          <w:sz w:val="21"/>
+        </w:rPr>
+        <w:t>5.3 The particulars of the licensed processing facility that produced these embryos are as follows.</w:t>
+      </w:r>
+    </w:p>
+    <w:tbl>
+      <w:tblPr>
+        <w:tblStyle w:val="TableGrid"/>
+        <w:tblW w:type="auto" w:w="0"/>
+        <w:tblLook w:firstColumn="1" w:firstRow="1" w:lastColumn="0" w:lastRow="0" w:noHBand="0" w:noVBand="1" w:val="04A0"/>
+      </w:tblPr>
+      <w:tblGrid>
+        <w:gridCol w:w="4873"/>
+        <w:gridCol w:w="4873"/>
+      </w:tblGrid>
+      <w:tr>
+        <w:tc>
+          <w:tcPr>
+            <w:tcW w:type="dxa" w:w="3402"/>
+            <w:shd w:val="clear" w:color="auto" w:fill="F2F2F2"/>
+          </w:tcPr>
+          <w:p>
+            <w:r>
+              <w:rPr>
+                <w:b/>
+              </w:rPr>
+              <w:t>Licensed facility</w:t>
+            </w:r>
+          </w:p>
+        </w:tc>
+        <w:tc>
+          <w:tcPr>
+            <w:tcW w:type="dxa" w:w="6236"/>
+          </w:tcPr>
+          <w:p>
+            <w:r/>
+          </w:p>
+        </w:tc>
+      </w:tr>
+      <w:tr>
+        <w:tc>
+          <w:tcPr>
+            <w:tcW w:type="dxa" w:w="3402"/>
+            <w:shd w:val="clear" w:color="auto" w:fill="F2F2F2"/>
+          </w:tcPr>
+          <w:p>
+            <w:r>
+              <w:rPr>
+                <w:b/>
+              </w:rPr>
+              <w:t>Licence No.</w:t>
+            </w:r>
+          </w:p>
+        </w:tc>
+        <w:tc>
+          <w:tcPr>
+            <w:tcW w:type="dxa" w:w="6236"/>
+          </w:tcPr>
+          <w:p>
+            <w:r/>
+          </w:p>
+        </w:tc>
+      </w:tr>
+      <w:tr>
+        <w:tc>
+          <w:tcPr>
+            <w:tcW w:type="dxa" w:w="3402"/>
+            <w:shd w:val="clear" w:color="auto" w:fill="F2F2F2"/>
+          </w:tcPr>
+          <w:p>
+            <w:r>
+              <w:rPr>
+                <w:b/>
+              </w:rPr>
+              <w:t>Type of licence</w:t>
+            </w:r>
+          </w:p>
+        </w:tc>
+        <w:tc>
+          <w:tcPr>
+            <w:tcW w:type="dxa" w:w="6236"/>
+          </w:tcPr>
+          <w:p>
+            <w:r>
+              <w:t>Processing of semen and embryos for artificial insemination</w:t>
+            </w:r>
+          </w:p>
+        </w:tc>
+      </w:tr>
+      <w:tr>
+        <w:tc>
+          <w:tcPr>
+            <w:tcW w:type="dxa" w:w="3402"/>
+            <w:shd w:val="clear" w:color="auto" w:fill="F2F2F2"/>
+          </w:tcPr>
+          <w:p>
+            <w:r>
+              <w:rPr>
+                <w:b/>
+              </w:rPr>
+              <w:t>Competent authority</w:t>
+            </w:r>
+          </w:p>
+        </w:tc>
+        <w:tc>
+          <w:tcPr>
+            <w:tcW w:type="dxa" w:w="6236"/>
+          </w:tcPr>
+          <w:p>
+            <w:r>
+              <w:t>Gyeonggi Province / Anseong, Republic of Korea</w:t>
+            </w:r>
+          </w:p>
+        </w:tc>
+      </w:tr>
+      <w:tr>
+        <w:tc>
+          <w:tcPr>
+            <w:tcW w:type="dxa" w:w="3402"/>
+            <w:shd w:val="clear" w:color="auto" w:fill="F2F2F2"/>
+          </w:tcPr>
+          <w:p>
+            <w:r>
+              <w:rPr>
+                <w:b/>
+              </w:rPr>
+              <w:t>Date of licence</w:t>
+            </w:r>
+          </w:p>
+        </w:tc>
+        <w:tc>
+          <w:tcPr>
+            <w:tcW w:type="dxa" w:w="6236"/>
+          </w:tcPr>
+          <w:p>
+            <w:r/>
+          </w:p>
+        </w:tc>
+      </w:tr>
+      <w:tr>
+        <w:tc>
+          <w:tcPr>
+            <w:tcW w:type="dxa" w:w="3402"/>
+            <w:shd w:val="clear" w:color="auto" w:fill="F2F2F2"/>
+          </w:tcPr>
+          <w:p>
+            <w:r>
+              <w:rPr>
+                <w:b/>
+              </w:rPr>
+              <w:t>Address</w:t>
+            </w:r>
+          </w:p>
+        </w:tc>
+        <w:tc>
+          <w:tcPr>
+            <w:tcW w:type="dxa" w:w="6236"/>
+          </w:tcPr>
+          <w:p>
+            <w:r/>
+          </w:p>
+        </w:tc>
+      </w:tr>
+    </w:tbl>
+    <w:p>
+      <w:r>
+        <w:rPr>
           <w:i/>
           <w:color w:val="7F7F7F"/>
           <w:sz w:val="19"/>
         </w:rPr>
-        <w:t>(List/registration numbers of approved facilities and the recognition procedure to be finalised by bilateral agreement.)</w:t>
+        <w:t>(Licence number, date and exact authority name to be entered per the original licence certificate; facility registration/recognition procedure to be finalised by bilateral agreement.)</w:t>
       </w:r>
     </w:p>
     <w:p>

</xml_diff>

<commit_message>
Switch Article 5.3 to licence-as-attachment; add licence copy to Article 7 documents (KO/EN)
- Replace licence particulars table with reference to attached copy of the semen/embryo processing licence
- Add licence copy to the list of accompanying documents in Article 7

https://claude.ai/code/session_01JRKJZw8Qbfes22ZyVqJCWL
</commit_message>
<xml_diff>
--- a/exports/Korea_Holstein_IVF_Embryo_Health_Requirement_EN.docx
+++ b/exports/Korea_Holstein_IVF_Embryo_Health_Requirement_EN.docx
@@ -536,168 +536,9 @@
           <w:i w:val="0"/>
           <w:sz w:val="21"/>
         </w:rPr>
-        <w:t>5.3 The particulars of the licensed processing facility that produced these embryos are as follows.</w:t>
+        <w:t>5.3 A copy of the licence for the processing of semen and embryos for artificial insemination, held by the facility that produced these embryos, is attached to these Veterinary Health Requirements as a supporting document, thereby evidencing the facility's possession of the national licence.</w:t>
       </w:r>
     </w:p>
-    <w:tbl>
-      <w:tblPr>
-        <w:tblStyle w:val="TableGrid"/>
-        <w:tblW w:type="auto" w:w="0"/>
-        <w:tblLook w:firstColumn="1" w:firstRow="1" w:lastColumn="0" w:lastRow="0" w:noHBand="0" w:noVBand="1" w:val="04A0"/>
-      </w:tblPr>
-      <w:tblGrid>
-        <w:gridCol w:w="4873"/>
-        <w:gridCol w:w="4873"/>
-      </w:tblGrid>
-      <w:tr>
-        <w:tc>
-          <w:tcPr>
-            <w:tcW w:type="dxa" w:w="3402"/>
-            <w:shd w:val="clear" w:color="auto" w:fill="F2F2F2"/>
-          </w:tcPr>
-          <w:p>
-            <w:r>
-              <w:rPr>
-                <w:b/>
-              </w:rPr>
-              <w:t>Licensed facility</w:t>
-            </w:r>
-          </w:p>
-        </w:tc>
-        <w:tc>
-          <w:tcPr>
-            <w:tcW w:type="dxa" w:w="6236"/>
-          </w:tcPr>
-          <w:p>
-            <w:r/>
-          </w:p>
-        </w:tc>
-      </w:tr>
-      <w:tr>
-        <w:tc>
-          <w:tcPr>
-            <w:tcW w:type="dxa" w:w="3402"/>
-            <w:shd w:val="clear" w:color="auto" w:fill="F2F2F2"/>
-          </w:tcPr>
-          <w:p>
-            <w:r>
-              <w:rPr>
-                <w:b/>
-              </w:rPr>
-              <w:t>Licence No.</w:t>
-            </w:r>
-          </w:p>
-        </w:tc>
-        <w:tc>
-          <w:tcPr>
-            <w:tcW w:type="dxa" w:w="6236"/>
-          </w:tcPr>
-          <w:p>
-            <w:r/>
-          </w:p>
-        </w:tc>
-      </w:tr>
-      <w:tr>
-        <w:tc>
-          <w:tcPr>
-            <w:tcW w:type="dxa" w:w="3402"/>
-            <w:shd w:val="clear" w:color="auto" w:fill="F2F2F2"/>
-          </w:tcPr>
-          <w:p>
-            <w:r>
-              <w:rPr>
-                <w:b/>
-              </w:rPr>
-              <w:t>Type of licence</w:t>
-            </w:r>
-          </w:p>
-        </w:tc>
-        <w:tc>
-          <w:tcPr>
-            <w:tcW w:type="dxa" w:w="6236"/>
-          </w:tcPr>
-          <w:p>
-            <w:r>
-              <w:t>Processing of semen and embryos for artificial insemination</w:t>
-            </w:r>
-          </w:p>
-        </w:tc>
-      </w:tr>
-      <w:tr>
-        <w:tc>
-          <w:tcPr>
-            <w:tcW w:type="dxa" w:w="3402"/>
-            <w:shd w:val="clear" w:color="auto" w:fill="F2F2F2"/>
-          </w:tcPr>
-          <w:p>
-            <w:r>
-              <w:rPr>
-                <w:b/>
-              </w:rPr>
-              <w:t>Competent authority</w:t>
-            </w:r>
-          </w:p>
-        </w:tc>
-        <w:tc>
-          <w:tcPr>
-            <w:tcW w:type="dxa" w:w="6236"/>
-          </w:tcPr>
-          <w:p>
-            <w:r>
-              <w:t>Gyeonggi Province / Anseong, Republic of Korea</w:t>
-            </w:r>
-          </w:p>
-        </w:tc>
-      </w:tr>
-      <w:tr>
-        <w:tc>
-          <w:tcPr>
-            <w:tcW w:type="dxa" w:w="3402"/>
-            <w:shd w:val="clear" w:color="auto" w:fill="F2F2F2"/>
-          </w:tcPr>
-          <w:p>
-            <w:r>
-              <w:rPr>
-                <w:b/>
-              </w:rPr>
-              <w:t>Date of licence</w:t>
-            </w:r>
-          </w:p>
-        </w:tc>
-        <w:tc>
-          <w:tcPr>
-            <w:tcW w:type="dxa" w:w="6236"/>
-          </w:tcPr>
-          <w:p>
-            <w:r/>
-          </w:p>
-        </w:tc>
-      </w:tr>
-      <w:tr>
-        <w:tc>
-          <w:tcPr>
-            <w:tcW w:type="dxa" w:w="3402"/>
-            <w:shd w:val="clear" w:color="auto" w:fill="F2F2F2"/>
-          </w:tcPr>
-          <w:p>
-            <w:r>
-              <w:rPr>
-                <w:b/>
-              </w:rPr>
-              <w:t>Address</w:t>
-            </w:r>
-          </w:p>
-        </w:tc>
-        <w:tc>
-          <w:tcPr>
-            <w:tcW w:type="dxa" w:w="6236"/>
-          </w:tcPr>
-          <w:p>
-            <w:r/>
-          </w:p>
-        </w:tc>
-      </w:tr>
-    </w:tbl>
     <w:p>
       <w:r>
         <w:rPr>
@@ -705,7 +546,7 @@
           <w:color w:val="7F7F7F"/>
           <w:sz w:val="19"/>
         </w:rPr>
-        <w:t>(Licence number, date and exact authority name to be entered per the original licence certificate; facility registration/recognition procedure to be finalised by bilateral agreement.)</w:t>
+        <w:t>(Attachment: copy of the licence for the processing of semen and embryos for artificial insemination.)</w:t>
       </w:r>
     </w:p>
     <w:p>
@@ -775,7 +616,7 @@
           <w:i w:val="0"/>
           <w:sz w:val="21"/>
         </w:rPr>
-        <w:t>7.1 The consignment is accompanied by: Commercial Invoice, Packing List, Certificate of Origin, Veterinary Health Certificate, and Embryo List (with donor/sire/straw IDs and seal number).</w:t>
+        <w:t>7.1 The consignment is accompanied by: Commercial Invoice, Packing List, Certificate of Origin, Veterinary Health Certificate, Embryo List (with donor/sire/straw IDs and seal number), and a copy of the licence for the processing of semen and embryos.</w:t>
       </w:r>
     </w:p>
     <w:p>

</xml_diff>